<commit_message>
feat(analysis): use cleaned data in travel time
Read data/all_tasks_clean.csv instead of the raw export and take the
date from the file. The split-session sensitivity check is removed
because job identity is now resolved upstream and no disposal-trip job
was merged or split. The headline is unchanged: 0.9 clock hours and 3.0
person-hours per job over 7 of 36 jobs.

Prompts:
- 2026-09-29-014-what-are-your-next-recommendations
- 2026-09-29-015-do-whatever-you-recommend-and-commit

Closes #6

Assisted-by: Claude claude-fable-5-1
</commit_message>
<xml_diff>
--- a/analysis/q2-travel-time/_manuscript/index.docx
+++ b/analysis/q2-travel-time/_manuscript/index.docx
@@ -202,10 +202,10 @@
         <w:rPr>
           <w:rStyle w:val="VerbatimChar"/>
         </w:rPr>
-        <w:t xml:space="preserve">data/all_tasks.csv</w:t>
-      </w:r>
-      <w:r>
-        <w:t xml:space="preserve">) contains 10,784 task entries</w:t>
+        <w:t xml:space="preserve">data/all_tasks_clean.csv</w:t>
+      </w:r>
+      <w:r>
+        <w:t xml:space="preserve">) contains 10,778 task entries</w:t>
       </w:r>
       <w:r>
         <w:t xml:space="preserve"> </w:t>
@@ -285,13 +285,13 @@
         <w:t xml:space="preserve"> </w:t>
       </w:r>
       <w:r>
-        <w:t xml:space="preserve">106 errand entries (15.5</w:t>
-      </w:r>
-      <w:r>
-        <w:t xml:space="preserve"> </w:t>
-      </w:r>
-      <w:r>
-        <w:t xml:space="preserve">person-hours in 22 jobs) are excluded. Travel</w:t>
+        <w:t xml:space="preserve">104 errand entries (15.5</w:t>
+      </w:r>
+      <w:r>
+        <w:t xml:space="preserve"> </w:t>
+      </w:r>
+      <w:r>
+        <w:t xml:space="preserve">person-hours in 23 jobs) are excluded. Travel</w:t>
       </w:r>
       <w:r>
         <w:t xml:space="preserve"> </w:t>
@@ -522,7 +522,7 @@
         <w:pStyle w:val="BodyText"/>
       </w:pPr>
       <w:r>
-        <w:t xml:space="preserve">Other data checks: the file has no missing values except</w:t>
+        <w:t xml:space="preserve">The file is the cleaned version of the raw app export, produced by</w:t>
       </w:r>
       <w:r>
         <w:t xml:space="preserve"> </w:t>
@@ -531,28 +531,55 @@
         <w:rPr>
           <w:rStyle w:val="VerbatimChar"/>
         </w:rPr>
-        <w:t xml:space="preserve">subtask</w:t>
-      </w:r>
-      <w:r>
-        <w:t xml:space="preserve">, which is</w:t>
-      </w:r>
-      <w:r>
-        <w:t xml:space="preserve"> </w:t>
-      </w:r>
-      <w:r>
-        <w:t xml:space="preserve">empty by design for the Rest and Disposal tasks. Recorded durations agree with</w:t>
-      </w:r>
-      <w:r>
-        <w:t xml:space="preserve"> </w:t>
-      </w:r>
-      <w:r>
-        <w:t xml:space="preserve">the difference between end and start times to within ±1 second. No job crosses</w:t>
-      </w:r>
-      <w:r>
-        <w:t xml:space="preserve"> </w:t>
-      </w:r>
-      <w:r>
-        <w:t xml:space="preserve">midnight, so elapsed time can be computed from clock times directly.</w:t>
+        <w:t xml:space="preserve">data-review/clean.R</w:t>
+      </w:r>
+      <w:r>
+        <w:t xml:space="preserve"> </w:t>
+      </w:r>
+      <w:r>
+        <w:t xml:space="preserve">and documented in</w:t>
+      </w:r>
+      <w:r>
+        <w:t xml:space="preserve"> </w:t>
+      </w:r>
+      <w:r>
+        <w:rPr>
+          <w:rStyle w:val="VerbatimChar"/>
+        </w:rPr>
+        <w:t xml:space="preserve">data-review/README.md</w:t>
+      </w:r>
+      <w:r>
+        <w:t xml:space="preserve">: accidental</w:t>
+      </w:r>
+      <w:r>
+        <w:t xml:space="preserve"> </w:t>
+      </w:r>
+      <w:r>
+        <w:t xml:space="preserve">taps shorter than 2 seconds were dropped, one subtask label was harmonised and</w:t>
+      </w:r>
+      <w:r>
+        <w:t xml:space="preserve"> </w:t>
+      </w:r>
+      <w:r>
+        <w:t xml:space="preserve">job identities were corrected from field knowledge. None of the corrections</w:t>
+      </w:r>
+      <w:r>
+        <w:t xml:space="preserve"> </w:t>
+      </w:r>
+      <w:r>
+        <w:t xml:space="preserve">touches a job with a disposal trip. Recorded durations agree with the</w:t>
+      </w:r>
+      <w:r>
+        <w:t xml:space="preserve"> </w:t>
+      </w:r>
+      <w:r>
+        <w:t xml:space="preserve">difference between end and start times to within ±1 second, and no trip</w:t>
+      </w:r>
+      <w:r>
+        <w:t xml:space="preserve"> </w:t>
+      </w:r>
+      <w:r>
+        <w:t xml:space="preserve">crosses midnight.</w:t>
       </w:r>
     </w:p>
     <w:bookmarkEnd w:id="11"/>
@@ -1705,13 +1732,13 @@
         <w:pStyle w:val="BodyText"/>
       </w:pPr>
       <w:r>
-        <w:t xml:space="preserve">Two sensitivity checks. First, keeping the short entries dropped in the</w:t>
-      </w:r>
-      <w:r>
-        <w:t xml:space="preserve"> </w:t>
-      </w:r>
-      <w:r>
-        <w:t xml:space="preserve">Methods adds one job and changes the mean elapsed travel time to</w:t>
+        <w:t xml:space="preserve">As a sensitivity check, keeping the short entries dropped in the Methods</w:t>
+      </w:r>
+      <w:r>
+        <w:t xml:space="preserve"> </w:t>
+      </w:r>
+      <w:r>
+        <w:t xml:space="preserve">adds one job and changes the mean elapsed travel time to</w:t>
       </w:r>
       <w:r>
         <w:t xml:space="preserve"> </w:t>
@@ -1735,19 +1762,7 @@
         <w:t xml:space="preserve"> </w:t>
       </w:r>
       <w:r>
-        <w:t xml:space="preserve">0.7-minute entry. Second, the data</w:t>
-      </w:r>
-      <w:r>
-        <w:t xml:space="preserve"> </w:t>
-      </w:r>
-      <w:r>
-        <w:t xml:space="preserve">review found three job IDs that each hold two recording sessions by different</w:t>
-      </w:r>
-      <w:r>
-        <w:t xml:space="preserve"> </w:t>
-      </w:r>
-      <w:r>
-        <w:t xml:space="preserve">crews and may be two jobs. None of the jobs with a disposal trip is among them, so the result is unaffected.</w:t>
+        <w:t xml:space="preserve">0.7-minute entry.</w:t>
       </w:r>
     </w:p>
     <w:bookmarkEnd w:id="18"/>

</xml_diff>

<commit_message>
fix(analysis): show dates in travel-time table and figure
Replace job IDs with the job date in the first column of the job table
(now "Job Date") and on the y-axis of the per-job figure, add a Median
row below the Mean row, and name the two busiest jobs by date in the
text for consistency. Also repair the abstract, where an editor rewrap
had displaced one sentence, and keep the new 72-column wrap setting.

Prompts:
- 2026-09-29-016-work-through-the-todos-in-q2-index-qmd

Human-authored: true
Assisted-by: Claude claude-fable-5-1
</commit_message>
<xml_diff>
--- a/analysis/q2-travel-time/_manuscript/index.docx
+++ b/analysis/q2-travel-time/_manuscript/index.docx
@@ -124,37 +124,37 @@
         <w:pStyle w:val="FirstParagraph"/>
       </w:pPr>
       <w:r>
-        <w:t xml:space="preserve">Time-driven activity-based costing (TDABC) allocates costs to activities based</w:t>
-      </w:r>
-      <w:r>
-        <w:t xml:space="preserve"> </w:t>
-      </w:r>
-      <w:r>
-        <w:t xml:space="preserve">on the time resources spend on them. Manual pit emptying in Mzuzu involves not</w:t>
-      </w:r>
-      <w:r>
-        <w:t xml:space="preserve"> </w:t>
-      </w:r>
-      <w:r>
-        <w:t xml:space="preserve">only emptying the pit but also transporting the extracted sludge to a disposal</w:t>
-      </w:r>
-      <w:r>
-        <w:t xml:space="preserve"> </w:t>
-      </w:r>
-      <w:r>
-        <w:t xml:space="preserve">site, an activity that takes the whole team away from the site and consumes</w:t>
-      </w:r>
-      <w:r>
-        <w:t xml:space="preserve"> </w:t>
-      </w:r>
-      <w:r>
-        <w:t xml:space="preserve">labour capacity that must be costed. This short manuscript answers the</w:t>
-      </w:r>
-      <w:r>
-        <w:t xml:space="preserve"> </w:t>
-      </w:r>
-      <w:r>
-        <w:t xml:space="preserve">question:</w:t>
+        <w:t xml:space="preserve">Time-driven activity-based costing (TDABC) allocates costs to activities</w:t>
+      </w:r>
+      <w:r>
+        <w:t xml:space="preserve"> </w:t>
+      </w:r>
+      <w:r>
+        <w:t xml:space="preserve">based on the time resources spend on them. Manual pit emptying in Mzuzu</w:t>
+      </w:r>
+      <w:r>
+        <w:t xml:space="preserve"> </w:t>
+      </w:r>
+      <w:r>
+        <w:t xml:space="preserve">involves not only emptying the pit but also transporting the extracted</w:t>
+      </w:r>
+      <w:r>
+        <w:t xml:space="preserve"> </w:t>
+      </w:r>
+      <w:r>
+        <w:t xml:space="preserve">sludge to a disposal site, an activity that takes the whole team away</w:t>
+      </w:r>
+      <w:r>
+        <w:t xml:space="preserve"> </w:t>
+      </w:r>
+      <w:r>
+        <w:t xml:space="preserve">from the site and consumes labour capacity that must be costed. This</w:t>
+      </w:r>
+      <w:r>
+        <w:t xml:space="preserve"> </w:t>
+      </w:r>
+      <w:r>
+        <w:t xml:space="preserve">short manuscript answers the question:</w:t>
       </w:r>
       <w:r>
         <w:t xml:space="preserve"> </w:t>
@@ -164,7 +164,7 @@
           <w:b/>
           <w:bCs/>
         </w:rPr>
-        <w:t xml:space="preserve">What is the average time spent per job travelling to the disposal</w:t>
+        <w:t xml:space="preserve">What is the average time spent</w:t>
       </w:r>
       <w:r>
         <w:rPr>
@@ -178,7 +178,21 @@
           <w:b/>
           <w:bCs/>
         </w:rPr>
-        <w:t xml:space="preserve">site, when a team travels to the disposal site?</w:t>
+        <w:t xml:space="preserve">per job travelling to the disposal site, when a team travels to the</w:t>
+      </w:r>
+      <w:r>
+        <w:rPr>
+          <w:b/>
+          <w:bCs/>
+        </w:rPr>
+        <w:t xml:space="preserve"> </w:t>
+      </w:r>
+      <w:r>
+        <w:rPr>
+          <w:b/>
+          <w:bCs/>
+        </w:rPr>
+        <w:t xml:space="preserve">disposal site?</w:t>
       </w:r>
     </w:p>
     <w:bookmarkEnd w:id="10"/>
@@ -205,43 +219,49 @@
         <w:t xml:space="preserve">data/all_tasks_clean.csv</w:t>
       </w:r>
       <w:r>
-        <w:t xml:space="preserve">) contains 10,778 task entries</w:t>
-      </w:r>
-      <w:r>
-        <w:t xml:space="preserve"> </w:t>
-      </w:r>
-      <w:r>
-        <w:t xml:space="preserve">recorded for 36 pit emptying jobs between</w:t>
-      </w:r>
-      <w:r>
-        <w:t xml:space="preserve"> </w:t>
-      </w:r>
-      <w:r>
-        <w:t xml:space="preserve">08 May 2026 and 14 September 2026,</w:t>
-      </w:r>
-      <w:r>
-        <w:t xml:space="preserve"> </w:t>
-      </w:r>
-      <w:r>
-        <w:t xml:space="preserve">performed by 19 anonymised pit emptiers (</w:t>
+        <w:t xml:space="preserve">) contains 10,778</w:t>
+      </w:r>
+      <w:r>
+        <w:t xml:space="preserve"> </w:t>
+      </w:r>
+      <w:r>
+        <w:t xml:space="preserve">task entries recorded for 36 pit emptying jobs between</w:t>
+      </w:r>
+      <w:r>
+        <w:t xml:space="preserve"> </w:t>
+      </w:r>
+      <w:r>
+        <w:t xml:space="preserve">08 May 2026 and</w:t>
+      </w:r>
+      <w:r>
+        <w:t xml:space="preserve"> </w:t>
+      </w:r>
+      <w:r>
+        <w:t xml:space="preserve">14 September 2026, performed by 19</w:t>
+      </w:r>
+      <w:r>
+        <w:t xml:space="preserve"> </w:t>
+      </w:r>
+      <w:r>
+        <w:t xml:space="preserve">anonymised pit emptiers (</w:t>
       </w:r>
       <w:r>
         <w:t xml:space="preserve">“gulpers”</w:t>
       </w:r>
       <w:r>
-        <w:t xml:space="preserve">). Each entry</w:t>
-      </w:r>
-      <w:r>
-        <w:t xml:space="preserve"> </w:t>
-      </w:r>
-      <w:r>
-        <w:t xml:space="preserve">records one worker performing one task with a start time, end time and</w:t>
-      </w:r>
-      <w:r>
-        <w:t xml:space="preserve"> </w:t>
-      </w:r>
-      <w:r>
-        <w:t xml:space="preserve">duration in seconds. The Travel task has two subtasks:</w:t>
+        <w:t xml:space="preserve">). Each entry records one worker</w:t>
+      </w:r>
+      <w:r>
+        <w:t xml:space="preserve"> </w:t>
+      </w:r>
+      <w:r>
+        <w:t xml:space="preserve">performing one task with a start time, end time and duration in seconds.</w:t>
+      </w:r>
+      <w:r>
+        <w:t xml:space="preserve"> </w:t>
+      </w:r>
+      <w:r>
+        <w:t xml:space="preserve">The Travel task has two subtasks:</w:t>
       </w:r>
       <w:r>
         <w:t xml:space="preserve"> </w:t>
@@ -254,13 +274,13 @@
         <w:t xml:space="preserve">On errand</w:t>
       </w:r>
       <w:r>
-        <w:t xml:space="preserve">, for short</w:t>
-      </w:r>
-      <w:r>
-        <w:t xml:space="preserve"> </w:t>
-      </w:r>
-      <w:r>
-        <w:t xml:space="preserve">in-job errands, and</w:t>
+        <w:t xml:space="preserve">, for short in-job errands,</w:t>
+      </w:r>
+      <w:r>
+        <w:t xml:space="preserve"> </w:t>
+      </w:r>
+      <w:r>
+        <w:t xml:space="preserve">and</w:t>
       </w:r>
       <w:r>
         <w:t xml:space="preserve"> </w:t>
@@ -273,37 +293,37 @@
         <w:t xml:space="preserve">Travel to disposal site</w:t>
       </w:r>
       <w:r>
-        <w:t xml:space="preserve">, for transporting sludge away</w:t>
-      </w:r>
-      <w:r>
-        <w:t xml:space="preserve"> </w:t>
-      </w:r>
-      <w:r>
-        <w:t xml:space="preserve">from the site. Only the second is analysed here. The</w:t>
-      </w:r>
-      <w:r>
-        <w:t xml:space="preserve"> </w:t>
-      </w:r>
-      <w:r>
-        <w:t xml:space="preserve">104 errand entries (15.5</w:t>
-      </w:r>
-      <w:r>
-        <w:t xml:space="preserve"> </w:t>
-      </w:r>
-      <w:r>
-        <w:t xml:space="preserve">person-hours in 23 jobs) are excluded. Travel</w:t>
-      </w:r>
-      <w:r>
-        <w:t xml:space="preserve"> </w:t>
-      </w:r>
-      <w:r>
-        <w:t xml:space="preserve">from the gulpers’ base to the job site is not among the recorded tasks, so</w:t>
-      </w:r>
-      <w:r>
-        <w:t xml:space="preserve"> </w:t>
-      </w:r>
-      <w:r>
-        <w:t xml:space="preserve">the figures below cover disposal trips made during a job only.</w:t>
+        <w:t xml:space="preserve">, for transporting sludge away from the</w:t>
+      </w:r>
+      <w:r>
+        <w:t xml:space="preserve"> </w:t>
+      </w:r>
+      <w:r>
+        <w:t xml:space="preserve">site. Only the second is analysed here. The 104 errand</w:t>
+      </w:r>
+      <w:r>
+        <w:t xml:space="preserve"> </w:t>
+      </w:r>
+      <w:r>
+        <w:t xml:space="preserve">entries (15.5 person-hours in</w:t>
+      </w:r>
+      <w:r>
+        <w:t xml:space="preserve"> </w:t>
+      </w:r>
+      <w:r>
+        <w:t xml:space="preserve">23 jobs) are excluded. Travel from the</w:t>
+      </w:r>
+      <w:r>
+        <w:t xml:space="preserve"> </w:t>
+      </w:r>
+      <w:r>
+        <w:t xml:space="preserve">gulpers’ base to the job site is not among the recorded tasks, so the</w:t>
+      </w:r>
+      <w:r>
+        <w:t xml:space="preserve"> </w:t>
+      </w:r>
+      <w:r>
+        <w:t xml:space="preserve">figures below cover disposal trips made during a job only.</w:t>
       </w:r>
     </w:p>
     <w:p>
@@ -311,19 +331,19 @@
         <w:pStyle w:val="BodyText"/>
       </w:pPr>
       <w:r>
-        <w:t xml:space="preserve">Gulpers travel to the disposal site together, so each trip appears in the data</w:t>
-      </w:r>
-      <w:r>
-        <w:t xml:space="preserve"> </w:t>
-      </w:r>
-      <w:r>
-        <w:t xml:space="preserve">as several near-identical entries, one per worker. Within each job, entries</w:t>
-      </w:r>
-      <w:r>
-        <w:t xml:space="preserve"> </w:t>
-      </w:r>
-      <w:r>
-        <w:t xml:space="preserve">that overlap in time are merged into a single</w:t>
+        <w:t xml:space="preserve">Gulpers travel to the disposal site together, so each trip appears in</w:t>
+      </w:r>
+      <w:r>
+        <w:t xml:space="preserve"> </w:t>
+      </w:r>
+      <w:r>
+        <w:t xml:space="preserve">the data as several near-identical entries, one per worker. Within each</w:t>
+      </w:r>
+      <w:r>
+        <w:t xml:space="preserve"> </w:t>
+      </w:r>
+      <w:r>
+        <w:t xml:space="preserve">job, entries that overlap in time are merged into a single</w:t>
       </w:r>
       <w:r>
         <w:t xml:space="preserve"> </w:t>
@@ -339,19 +359,13 @@
         <w:t xml:space="preserve"> </w:t>
       </w:r>
       <w:r>
-        <w:t xml:space="preserve">running from the</w:t>
-      </w:r>
-      <w:r>
-        <w:t xml:space="preserve"> </w:t>
-      </w:r>
-      <w:r>
-        <w:t xml:space="preserve">earliest start to the latest end. Travel time per job is then reported in two</w:t>
-      </w:r>
-      <w:r>
-        <w:t xml:space="preserve"> </w:t>
-      </w:r>
-      <w:r>
-        <w:t xml:space="preserve">ways:</w:t>
+        <w:t xml:space="preserve">running from the earliest start to the latest end. Travel time per job</w:t>
+      </w:r>
+      <w:r>
+        <w:t xml:space="preserve"> </w:t>
+      </w:r>
+      <w:r>
+        <w:t xml:space="preserve">is then reported in two ways:</w:t>
       </w:r>
     </w:p>
     <w:p>
@@ -373,19 +387,19 @@
         <w:t xml:space="preserve"> </w:t>
       </w:r>
       <w:r>
-        <w:t xml:space="preserve">the summed duration of the job’s trips. A</w:t>
-      </w:r>
-      <w:r>
-        <w:t xml:space="preserve"> </w:t>
-      </w:r>
-      <w:r>
-        <w:t xml:space="preserve">trip made by four gulpers together counts once. This is the headline</w:t>
-      </w:r>
-      <w:r>
-        <w:t xml:space="preserve"> </w:t>
-      </w:r>
-      <w:r>
-        <w:t xml:space="preserve">measure, since it answers how long the team was away.</w:t>
+        <w:t xml:space="preserve">the summed duration of the job’s</w:t>
+      </w:r>
+      <w:r>
+        <w:t xml:space="preserve"> </w:t>
+      </w:r>
+      <w:r>
+        <w:t xml:space="preserve">trips. A trip made by four gulpers together counts once. This is the</w:t>
+      </w:r>
+      <w:r>
+        <w:t xml:space="preserve"> </w:t>
+      </w:r>
+      <w:r>
+        <w:t xml:space="preserve">headline measure, since it answers how long the team was away.</w:t>
       </w:r>
     </w:p>
     <w:p>
@@ -428,25 +442,25 @@
         <w:t xml:space="preserve"> </w:t>
       </w:r>
       <w:r>
-        <w:t xml:space="preserve">disposal-site entries, i.e. every worker’s travel added together. This is</w:t>
-      </w:r>
-      <w:r>
-        <w:t xml:space="preserve"> </w:t>
-      </w:r>
-      <w:r>
-        <w:t xml:space="preserve">the measure relevant for TDABC, where labour capacity is the resource being</w:t>
-      </w:r>
-      <w:r>
-        <w:t xml:space="preserve"> </w:t>
-      </w:r>
-      <w:r>
-        <w:t xml:space="preserve">costed, and it matches the measure used in the companion manuscript on</w:t>
-      </w:r>
-      <w:r>
-        <w:t xml:space="preserve"> </w:t>
-      </w:r>
-      <w:r>
-        <w:t xml:space="preserve">total job time.</w:t>
+        <w:t xml:space="preserve">disposal-site entries, i.e. every worker’s travel added together. This</w:t>
+      </w:r>
+      <w:r>
+        <w:t xml:space="preserve"> </w:t>
+      </w:r>
+      <w:r>
+        <w:t xml:space="preserve">is the measure relevant for TDABC, where labour capacity is the</w:t>
+      </w:r>
+      <w:r>
+        <w:t xml:space="preserve"> </w:t>
+      </w:r>
+      <w:r>
+        <w:t xml:space="preserve">resource being costed, and it matches the measure used in the</w:t>
+      </w:r>
+      <w:r>
+        <w:t xml:space="preserve"> </w:t>
+      </w:r>
+      <w:r>
+        <w:t xml:space="preserve">companion manuscript on total job time.</w:t>
       </w:r>
     </w:p>
     <w:p>
@@ -454,67 +468,85 @@
         <w:pStyle w:val="FirstParagraph"/>
       </w:pPr>
       <w:r>
-        <w:t xml:space="preserve">The population is the set of jobs in which the team travelled to the disposal</w:t>
-      </w:r>
-      <w:r>
-        <w:t xml:space="preserve"> </w:t>
-      </w:r>
-      <w:r>
-        <w:t xml:space="preserve">site. Genuine trips last 28–46</w:t>
-      </w:r>
-      <w:r>
-        <w:t xml:space="preserve"> </w:t>
-      </w:r>
-      <w:r>
-        <w:t xml:space="preserve">minutes. A few disposal-site entries are far shorter and cannot represent a</w:t>
-      </w:r>
-      <w:r>
-        <w:t xml:space="preserve"> </w:t>
-      </w:r>
-      <w:r>
-        <w:t xml:space="preserve">trip: 3 merged intervals of under 5 minutes</w:t>
-      </w:r>
-      <w:r>
-        <w:t xml:space="preserve"> </w:t>
-      </w:r>
-      <w:r>
-        <w:t xml:space="preserve">(3, 42, 69 seconds), each</w:t>
-      </w:r>
-      <w:r>
-        <w:t xml:space="preserve"> </w:t>
-      </w:r>
-      <w:r>
-        <w:t xml:space="preserve">recorded by one or two workers and including a 2.9-second entry already</w:t>
-      </w:r>
-      <w:r>
-        <w:t xml:space="preserve"> </w:t>
-      </w:r>
-      <w:r>
-        <w:t xml:space="preserve">flagged in the data review. These are treated as accidental taps and dropped,</w:t>
-      </w:r>
-      <w:r>
-        <w:t xml:space="preserve"> </w:t>
-      </w:r>
-      <w:r>
-        <w:t xml:space="preserve">which removes 3.0 person-minutes. One job</w:t>
-      </w:r>
-      <w:r>
-        <w:t xml:space="preserve"> </w:t>
-      </w:r>
-      <w:r>
-        <w:t xml:space="preserve">(2026-09-03_03) has only such an entry and</w:t>
-      </w:r>
-      <w:r>
-        <w:t xml:space="preserve"> </w:t>
-      </w:r>
-      <w:r>
-        <w:t xml:space="preserve">therefore does not count as a job with a disposal trip. The effect of keeping</w:t>
-      </w:r>
-      <w:r>
-        <w:t xml:space="preserve"> </w:t>
-      </w:r>
-      <w:r>
-        <w:t xml:space="preserve">these entries is reported in the Results.</w:t>
+        <w:t xml:space="preserve">The population is the set of jobs in which the team travelled to the</w:t>
+      </w:r>
+      <w:r>
+        <w:t xml:space="preserve"> </w:t>
+      </w:r>
+      <w:r>
+        <w:t xml:space="preserve">disposal site. Genuine trips last</w:t>
+      </w:r>
+      <w:r>
+        <w:t xml:space="preserve"> </w:t>
+      </w:r>
+      <w:r>
+        <w:t xml:space="preserve">28–46</w:t>
+      </w:r>
+      <w:r>
+        <w:t xml:space="preserve"> </w:t>
+      </w:r>
+      <w:r>
+        <w:t xml:space="preserve">minutes. A few disposal-site entries are far shorter and cannot</w:t>
+      </w:r>
+      <w:r>
+        <w:t xml:space="preserve"> </w:t>
+      </w:r>
+      <w:r>
+        <w:t xml:space="preserve">represent a trip: 3 merged intervals of under</w:t>
+      </w:r>
+      <w:r>
+        <w:t xml:space="preserve"> </w:t>
+      </w:r>
+      <w:r>
+        <w:t xml:space="preserve">5 minutes</w:t>
+      </w:r>
+      <w:r>
+        <w:t xml:space="preserve"> </w:t>
+      </w:r>
+      <w:r>
+        <w:t xml:space="preserve">(3, 42, 69</w:t>
+      </w:r>
+      <w:r>
+        <w:t xml:space="preserve"> </w:t>
+      </w:r>
+      <w:r>
+        <w:t xml:space="preserve">seconds), each recorded by one or two workers and including a 2.9-second</w:t>
+      </w:r>
+      <w:r>
+        <w:t xml:space="preserve"> </w:t>
+      </w:r>
+      <w:r>
+        <w:t xml:space="preserve">entry already flagged in the data review. These are treated as</w:t>
+      </w:r>
+      <w:r>
+        <w:t xml:space="preserve"> </w:t>
+      </w:r>
+      <w:r>
+        <w:t xml:space="preserve">accidental taps and dropped, which removes</w:t>
+      </w:r>
+      <w:r>
+        <w:t xml:space="preserve"> </w:t>
+      </w:r>
+      <w:r>
+        <w:t xml:space="preserve">3.0 person-minutes. One job</w:t>
+      </w:r>
+      <w:r>
+        <w:t xml:space="preserve"> </w:t>
+      </w:r>
+      <w:r>
+        <w:t xml:space="preserve">(2026-09-03_03) has only such an</w:t>
+      </w:r>
+      <w:r>
+        <w:t xml:space="preserve"> </w:t>
+      </w:r>
+      <w:r>
+        <w:t xml:space="preserve">entry and therefore does not count as a job with a disposal trip. The</w:t>
+      </w:r>
+      <w:r>
+        <w:t xml:space="preserve"> </w:t>
+      </w:r>
+      <w:r>
+        <w:t xml:space="preserve">effect of keeping these entries is reported in the Results.</w:t>
       </w:r>
     </w:p>
     <w:p>
@@ -549,37 +581,37 @@
         <w:t xml:space="preserve">data-review/README.md</w:t>
       </w:r>
       <w:r>
-        <w:t xml:space="preserve">: accidental</w:t>
-      </w:r>
-      <w:r>
-        <w:t xml:space="preserve"> </w:t>
-      </w:r>
-      <w:r>
-        <w:t xml:space="preserve">taps shorter than 2 seconds were dropped, one subtask label was harmonised and</w:t>
-      </w:r>
-      <w:r>
-        <w:t xml:space="preserve"> </w:t>
-      </w:r>
-      <w:r>
-        <w:t xml:space="preserve">job identities were corrected from field knowledge. None of the corrections</w:t>
-      </w:r>
-      <w:r>
-        <w:t xml:space="preserve"> </w:t>
-      </w:r>
-      <w:r>
-        <w:t xml:space="preserve">touches a job with a disposal trip. Recorded durations agree with the</w:t>
-      </w:r>
-      <w:r>
-        <w:t xml:space="preserve"> </w:t>
-      </w:r>
-      <w:r>
-        <w:t xml:space="preserve">difference between end and start times to within ±1 second, and no trip</w:t>
-      </w:r>
-      <w:r>
-        <w:t xml:space="preserve"> </w:t>
-      </w:r>
-      <w:r>
-        <w:t xml:space="preserve">crosses midnight.</w:t>
+        <w:t xml:space="preserve">:</w:t>
+      </w:r>
+      <w:r>
+        <w:t xml:space="preserve"> </w:t>
+      </w:r>
+      <w:r>
+        <w:t xml:space="preserve">accidental taps shorter than 2 seconds were dropped, one subtask label</w:t>
+      </w:r>
+      <w:r>
+        <w:t xml:space="preserve"> </w:t>
+      </w:r>
+      <w:r>
+        <w:t xml:space="preserve">was harmonised and job identities were corrected from field knowledge.</w:t>
+      </w:r>
+      <w:r>
+        <w:t xml:space="preserve"> </w:t>
+      </w:r>
+      <w:r>
+        <w:t xml:space="preserve">None of the corrections touches a job with a disposal trip. Recorded</w:t>
+      </w:r>
+      <w:r>
+        <w:t xml:space="preserve"> </w:t>
+      </w:r>
+      <w:r>
+        <w:t xml:space="preserve">durations agree with the difference between end and start times to</w:t>
+      </w:r>
+      <w:r>
+        <w:t xml:space="preserve"> </w:t>
+      </w:r>
+      <w:r>
+        <w:t xml:space="preserve">within ±1 second, and no trip crosses midnight.</w:t>
       </w:r>
     </w:p>
     <w:bookmarkEnd w:id="11"/>
@@ -624,13 +656,13 @@
         <w:t xml:space="preserve">36 observed jobs</w:t>
       </w:r>
       <w:r>
-        <w:t xml:space="preserve">, making 11 trips in total. In those</w:t>
-      </w:r>
-      <w:r>
-        <w:t xml:space="preserve"> </w:t>
-      </w:r>
-      <w:r>
-        <w:t xml:space="preserve">jobs, the team spent on average</w:t>
+        <w:t xml:space="preserve">, making 11 trips in total. In</w:t>
+      </w:r>
+      <w:r>
+        <w:t xml:space="preserve"> </w:t>
+      </w:r>
+      <w:r>
+        <w:t xml:space="preserve">those jobs, the team spent on average</w:t>
       </w:r>
       <w:r>
         <w:t xml:space="preserve"> </w:t>
@@ -640,7 +672,7 @@
           <w:b/>
           <w:bCs/>
         </w:rPr>
-        <w:t xml:space="preserve">0.9 clock hours</w:t>
+        <w:t xml:space="preserve">0.9 clock</w:t>
       </w:r>
       <w:r>
         <w:rPr>
@@ -654,7 +686,7 @@
           <w:b/>
           <w:bCs/>
         </w:rPr>
-        <w:t xml:space="preserve">(52 minutes) per job travelling to the disposal</w:t>
+        <w:t xml:space="preserve">hours (52 minutes) per job travelling to the</w:t>
       </w:r>
       <w:r>
         <w:rPr>
@@ -668,7 +700,7 @@
           <w:b/>
           <w:bCs/>
         </w:rPr>
-        <w:t xml:space="preserve">site</w:t>
+        <w:t xml:space="preserve">disposal site</w:t>
       </w:r>
       <w:r>
         <w:t xml:space="preserve"> </w:t>
@@ -680,19 +712,25 @@
         <w:t xml:space="preserve"> </w:t>
       </w:r>
       <w:r>
-        <w:t xml:space="preserve">0.5–1.7). In labour time this is</w:t>
-      </w:r>
-      <w:r>
-        <w:t xml:space="preserve"> </w:t>
-      </w:r>
-      <w:r>
-        <w:t xml:space="preserve">3.0 person-hours per job (median 2.2,</w:t>
-      </w:r>
-      <w:r>
-        <w:t xml:space="preserve"> </w:t>
-      </w:r>
-      <w:r>
-        <w:t xml:space="preserve">range 0.9–6.0).</w:t>
+        <w:t xml:space="preserve">0.5–1.7). In labour time</w:t>
+      </w:r>
+      <w:r>
+        <w:t xml:space="preserve"> </w:t>
+      </w:r>
+      <w:r>
+        <w:t xml:space="preserve">this is 3.0 person-hours per job (median</w:t>
+      </w:r>
+      <w:r>
+        <w:t xml:space="preserve"> </w:t>
+      </w:r>
+      <w:r>
+        <w:t xml:space="preserve">2.2, range</w:t>
+      </w:r>
+      <w:r>
+        <w:t xml:space="preserve"> </w:t>
+      </w:r>
+      <w:r>
+        <w:t xml:space="preserve">0.9–6.0).</w:t>
       </w:r>
     </w:p>
     <w:p>
@@ -700,13 +738,13 @@
         <w:pStyle w:val="BodyText"/>
       </w:pPr>
       <w:r>
-        <w:t xml:space="preserve">A job with a disposal trip had 1.6 trips on average,</w:t>
-      </w:r>
-      <w:r>
-        <w:t xml:space="preserve"> </w:t>
-      </w:r>
-      <w:r>
-        <w:t xml:space="preserve">each lasting 33 minutes and made by</w:t>
+        <w:t xml:space="preserve">A job with a disposal trip had 1.6 trips on</w:t>
+      </w:r>
+      <w:r>
+        <w:t xml:space="preserve"> </w:t>
+      </w:r>
+      <w:r>
+        <w:t xml:space="preserve">average, each lasting 33 minutes and made by</w:t>
       </w:r>
       <w:r>
         <w:t xml:space="preserve"> </w:t>
@@ -718,37 +756,37 @@
         <w:t xml:space="preserve"> </w:t>
       </w:r>
       <w:r>
-        <w:t xml:space="preserve">3.4 times elapsed time. Within these jobs, disposal travel took up</w:t>
-      </w:r>
-      <w:r>
-        <w:t xml:space="preserve"> </w:t>
-      </w:r>
-      <w:r>
-        <w:t xml:space="preserve">17 % of the job’s labour time on average</w:t>
-      </w:r>
-      <w:r>
-        <w:t xml:space="preserve"> </w:t>
-      </w:r>
-      <w:r>
-        <w:t xml:space="preserve">(range 9–24 %). Across all</w:t>
-      </w:r>
-      <w:r>
-        <w:t xml:space="preserve"> </w:t>
-      </w:r>
-      <w:r>
-        <w:t xml:space="preserve">36 jobs, disposal travel accounts for</w:t>
-      </w:r>
-      <w:r>
-        <w:t xml:space="preserve"> </w:t>
-      </w:r>
-      <w:r>
-        <w:t xml:space="preserve">4.1 % of the 509.0 person-hours</w:t>
-      </w:r>
-      <w:r>
-        <w:t xml:space="preserve"> </w:t>
-      </w:r>
-      <w:r>
-        <w:t xml:space="preserve">recorded.</w:t>
+        <w:t xml:space="preserve">3.4 times elapsed time. Within these jobs, disposal travel</w:t>
+      </w:r>
+      <w:r>
+        <w:t xml:space="preserve"> </w:t>
+      </w:r>
+      <w:r>
+        <w:t xml:space="preserve">took up 17 % of the job’s labour time on</w:t>
+      </w:r>
+      <w:r>
+        <w:t xml:space="preserve"> </w:t>
+      </w:r>
+      <w:r>
+        <w:t xml:space="preserve">average (range 9–24</w:t>
+      </w:r>
+      <w:r>
+        <w:t xml:space="preserve"> </w:t>
+      </w:r>
+      <w:r>
+        <w:t xml:space="preserve">%). Across all 36 jobs, disposal travel accounts for</w:t>
+      </w:r>
+      <w:r>
+        <w:t xml:space="preserve"> </w:t>
+      </w:r>
+      <w:r>
+        <w:t xml:space="preserve">4.1 % of the 509.0</w:t>
+      </w:r>
+      <w:r>
+        <w:t xml:space="preserve"> </w:t>
+      </w:r>
+      <w:r>
+        <w:t xml:space="preserve">person-hours recorded.</w:t>
       </w:r>
       <w:r>
         <w:t xml:space="preserve"> </w:t>
@@ -782,13 +820,13 @@
         <w:t xml:space="preserve"> </w:t>
       </w:r>
       <w:r>
-        <w:t xml:space="preserve">shows the elapsed travel time</w:t>
-      </w:r>
-      <w:r>
-        <w:t xml:space="preserve"> </w:t>
-      </w:r>
-      <w:r>
-        <w:t xml:space="preserve">per job.</w:t>
+        <w:t xml:space="preserve">shows the</w:t>
+      </w:r>
+      <w:r>
+        <w:t xml:space="preserve"> </w:t>
+      </w:r>
+      <w:r>
+        <w:t xml:space="preserve">elapsed travel time per job.</w:t>
       </w:r>
     </w:p>
     <w:tbl>
@@ -826,12 +864,12 @@
               <w:tblLook w:firstRow="1" w:lastRow="0" w:firstColumn="0" w:lastColumn="0" w:noHBand="0" w:noVBand="0" w:val="0020"/>
             </w:tblPr>
             <w:tblGrid>
-              <w:gridCol w:w="1478"/>
-              <w:gridCol w:w="633"/>
-              <w:gridCol w:w="844"/>
-              <w:gridCol w:w="1267"/>
-              <w:gridCol w:w="1900"/>
-              <w:gridCol w:w="1795"/>
+              <w:gridCol w:w="1210"/>
+              <w:gridCol w:w="660"/>
+              <w:gridCol w:w="880"/>
+              <w:gridCol w:w="1320"/>
+              <w:gridCol w:w="1980"/>
+              <w:gridCol w:w="1870"/>
             </w:tblGrid>
             <w:tr>
               <w:trPr>
@@ -846,7 +884,7 @@
                     <w:jc w:val="center"/>
                   </w:pPr>
                   <w:r>
-                    <w:t xml:space="preserve">Job</w:t>
+                    <w:t xml:space="preserve">Job Date</w:t>
                   </w:r>
                 </w:p>
               </w:tc>
@@ -926,7 +964,7 @@
                     <w:jc w:val="center"/>
                   </w:pPr>
                   <w:r>
-                    <w:t xml:space="preserve">2026-05-08_01</w:t>
+                    <w:t xml:space="preserve">2026-05-08</w:t>
                   </w:r>
                 </w:p>
               </w:tc>
@@ -1006,7 +1044,7 @@
                     <w:jc w:val="center"/>
                   </w:pPr>
                   <w:r>
-                    <w:t xml:space="preserve">2026-08-08_01</w:t>
+                    <w:t xml:space="preserve">2026-08-08</w:t>
                   </w:r>
                 </w:p>
               </w:tc>
@@ -1086,7 +1124,7 @@
                     <w:jc w:val="center"/>
                   </w:pPr>
                   <w:r>
-                    <w:t xml:space="preserve">2026-08-11_03</w:t>
+                    <w:t xml:space="preserve">2026-08-11</w:t>
                   </w:r>
                 </w:p>
               </w:tc>
@@ -1166,7 +1204,7 @@
                     <w:jc w:val="center"/>
                   </w:pPr>
                   <w:r>
-                    <w:t xml:space="preserve">2026-08-20_02</w:t>
+                    <w:t xml:space="preserve">2026-08-20</w:t>
                   </w:r>
                 </w:p>
               </w:tc>
@@ -1246,7 +1284,7 @@
                     <w:jc w:val="center"/>
                   </w:pPr>
                   <w:r>
-                    <w:t xml:space="preserve">2026-09-08_01</w:t>
+                    <w:t xml:space="preserve">2026-09-08</w:t>
                   </w:r>
                 </w:p>
               </w:tc>
@@ -1326,7 +1364,7 @@
                     <w:jc w:val="center"/>
                   </w:pPr>
                   <w:r>
-                    <w:t xml:space="preserve">2026-09-13_05</w:t>
+                    <w:t xml:space="preserve">2026-09-13</w:t>
                   </w:r>
                 </w:p>
               </w:tc>
@@ -1406,7 +1444,7 @@
                     <w:jc w:val="center"/>
                   </w:pPr>
                   <w:r>
-                    <w:t xml:space="preserve">2026-09-14_02</w:t>
+                    <w:t xml:space="preserve">2026-09-14</w:t>
                   </w:r>
                 </w:p>
               </w:tc>
@@ -1552,6 +1590,86 @@
                   </w:pPr>
                   <w:r>
                     <w:t xml:space="preserve">16.6</w:t>
+                  </w:r>
+                </w:p>
+              </w:tc>
+            </w:tr>
+            <w:tr>
+              <w:tc>
+                <w:tcPr/>
+                <w:p>
+                  <w:pPr>
+                    <w:pStyle w:val="Compact"/>
+                    <w:jc w:val="left"/>
+                    <w:jc w:val="center"/>
+                  </w:pPr>
+                  <w:r>
+                    <w:t xml:space="preserve">Median</w:t>
+                  </w:r>
+                </w:p>
+              </w:tc>
+              <w:tc>
+                <w:tcPr/>
+                <w:p>
+                  <w:pPr>
+                    <w:pStyle w:val="Compact"/>
+                    <w:jc w:val="right"/>
+                    <w:jc w:val="center"/>
+                  </w:pPr>
+                  <w:r>
+                    <w:t xml:space="preserve">1.0</w:t>
+                  </w:r>
+                </w:p>
+              </w:tc>
+              <w:tc>
+                <w:tcPr/>
+                <w:p>
+                  <w:pPr>
+                    <w:pStyle w:val="Compact"/>
+                    <w:jc w:val="right"/>
+                    <w:jc w:val="center"/>
+                  </w:pPr>
+                  <w:r>
+                    <w:t xml:space="preserve">4.0</w:t>
+                  </w:r>
+                </w:p>
+              </w:tc>
+              <w:tc>
+                <w:tcPr/>
+                <w:p>
+                  <w:pPr>
+                    <w:pStyle w:val="Compact"/>
+                    <w:jc w:val="right"/>
+                    <w:jc w:val="center"/>
+                  </w:pPr>
+                  <w:r>
+                    <w:t xml:space="preserve">0.6</w:t>
+                  </w:r>
+                </w:p>
+              </w:tc>
+              <w:tc>
+                <w:tcPr/>
+                <w:p>
+                  <w:pPr>
+                    <w:pStyle w:val="Compact"/>
+                    <w:jc w:val="right"/>
+                    <w:jc w:val="center"/>
+                  </w:pPr>
+                  <w:r>
+                    <w:t xml:space="preserve">2.2</w:t>
+                  </w:r>
+                </w:p>
+              </w:tc>
+              <w:tc>
+                <w:tcPr/>
+                <w:p>
+                  <w:pPr>
+                    <w:pStyle w:val="Compact"/>
+                    <w:jc w:val="right"/>
+                    <w:jc w:val="center"/>
+                  </w:pPr>
+                  <w:r>
+                    <w:t xml:space="preserve">16.9</w:t>
                   </w:r>
                 </w:p>
               </w:tc>
@@ -1700,25 +1818,37 @@
         <w:pStyle w:val="BodyText"/>
       </w:pPr>
       <w:r>
-        <w:t xml:space="preserve">Travel time per job is driven mainly by the number of trips: jobs with one</w:t>
-      </w:r>
-      <w:r>
-        <w:t xml:space="preserve"> </w:t>
-      </w:r>
-      <w:r>
-        <w:t xml:space="preserve">trip take about half an hour of elapsed time, and the two jobs with the most</w:t>
-      </w:r>
-      <w:r>
-        <w:t xml:space="preserve"> </w:t>
-      </w:r>
-      <w:r>
-        <w:t xml:space="preserve">travel (2026-08-08_01 and 2026-09-08_01)</w:t>
-      </w:r>
-      <w:r>
-        <w:t xml:space="preserve"> </w:t>
-      </w:r>
-      <w:r>
-        <w:t xml:space="preserve">made 3 and 2</w:t>
+        <w:t xml:space="preserve">Travel time per job is driven mainly by the number of trips: jobs with</w:t>
+      </w:r>
+      <w:r>
+        <w:t xml:space="preserve"> </w:t>
+      </w:r>
+      <w:r>
+        <w:t xml:space="preserve">one trip take about half an hour of elapsed time, and the two jobs with</w:t>
+      </w:r>
+      <w:r>
+        <w:t xml:space="preserve"> </w:t>
+      </w:r>
+      <w:r>
+        <w:t xml:space="preserve">the most travel</w:t>
+      </w:r>
+      <w:r>
+        <w:t xml:space="preserve"> </w:t>
+      </w:r>
+      <w:r>
+        <w:t xml:space="preserve">(08 August 2026 and 08 September 2026)</w:t>
+      </w:r>
+      <w:r>
+        <w:t xml:space="preserve"> </w:t>
+      </w:r>
+      <w:r>
+        <w:t xml:space="preserve">made</w:t>
+      </w:r>
+      <w:r>
+        <w:t xml:space="preserve"> </w:t>
+      </w:r>
+      <w:r>
+        <w:t xml:space="preserve">3 and 2</w:t>
       </w:r>
       <w:r>
         <w:t xml:space="preserve"> </w:t>
@@ -1780,13 +1910,13 @@
         <w:pStyle w:val="FirstParagraph"/>
       </w:pPr>
       <w:r>
-        <w:t xml:space="preserve">When a pit emptying team in Mzuzu travels to the disposal site, it spends on</w:t>
-      </w:r>
-      <w:r>
-        <w:t xml:space="preserve"> </w:t>
-      </w:r>
-      <w:r>
-        <w:t xml:space="preserve">average</w:t>
+        <w:t xml:space="preserve">When a pit emptying team in Mzuzu travels to the disposal site, it</w:t>
+      </w:r>
+      <w:r>
+        <w:t xml:space="preserve"> </w:t>
+      </w:r>
+      <w:r>
+        <w:t xml:space="preserve">spends on average</w:t>
       </w:r>
       <w:r>
         <w:t xml:space="preserve"> </w:t>
@@ -1796,7 +1926,7 @@
           <w:b/>
           <w:bCs/>
         </w:rPr>
-        <w:t xml:space="preserve">0.9 clock hours (52</w:t>
+        <w:t xml:space="preserve">0.9 clock hours</w:t>
       </w:r>
       <w:r>
         <w:rPr>
@@ -1810,13 +1940,19 @@
           <w:b/>
           <w:bCs/>
         </w:rPr>
-        <w:t xml:space="preserve">minutes) per job</w:t>
-      </w:r>
-      <w:r>
-        <w:t xml:space="preserve"> </w:t>
-      </w:r>
-      <w:r>
-        <w:t xml:space="preserve">on that travel, corresponding to</w:t>
+        <w:t xml:space="preserve">(52 minutes) per job</w:t>
+      </w:r>
+      <w:r>
+        <w:t xml:space="preserve"> </w:t>
+      </w:r>
+      <w:r>
+        <w:t xml:space="preserve">on that travel,</w:t>
+      </w:r>
+      <w:r>
+        <w:t xml:space="preserve"> </w:t>
+      </w:r>
+      <w:r>
+        <w:t xml:space="preserve">corresponding to</w:t>
       </w:r>
       <w:r>
         <w:t xml:space="preserve"> </w:t>
@@ -1832,37 +1968,43 @@
         <w:t xml:space="preserve"> </w:t>
       </w:r>
       <w:r>
-        <w:t xml:space="preserve">of labour because</w:t>
-      </w:r>
-      <w:r>
-        <w:t xml:space="preserve"> </w:t>
-      </w:r>
-      <w:r>
-        <w:t xml:space="preserve">3.4 gulpers travel together. A single trip takes about</w:t>
-      </w:r>
-      <w:r>
-        <w:t xml:space="preserve"> </w:t>
-      </w:r>
-      <w:r>
-        <w:t xml:space="preserve">33 minutes, and jobs vary mainly in how many trips they</w:t>
-      </w:r>
-      <w:r>
-        <w:t xml:space="preserve"> </w:t>
-      </w:r>
-      <w:r>
-        <w:t xml:space="preserve">need. Such trips occurred in 7 of the 36 observed</w:t>
-      </w:r>
-      <w:r>
-        <w:t xml:space="preserve"> </w:t>
-      </w:r>
-      <w:r>
-        <w:t xml:space="preserve">jobs. For TDABC purposes the person-hour figure is the quantity to cost, and</w:t>
-      </w:r>
-      <w:r>
-        <w:t xml:space="preserve"> </w:t>
-      </w:r>
-      <w:r>
-        <w:t xml:space="preserve">it should be applied only to jobs that require a disposal trip.</w:t>
+        <w:t xml:space="preserve">of labour</w:t>
+      </w:r>
+      <w:r>
+        <w:t xml:space="preserve"> </w:t>
+      </w:r>
+      <w:r>
+        <w:t xml:space="preserve">because 3.4 gulpers travel together. A single</w:t>
+      </w:r>
+      <w:r>
+        <w:t xml:space="preserve"> </w:t>
+      </w:r>
+      <w:r>
+        <w:t xml:space="preserve">trip takes about 33 minutes, and jobs vary mainly</w:t>
+      </w:r>
+      <w:r>
+        <w:t xml:space="preserve"> </w:t>
+      </w:r>
+      <w:r>
+        <w:t xml:space="preserve">in how many trips they need. Such trips occurred in 7 of</w:t>
+      </w:r>
+      <w:r>
+        <w:t xml:space="preserve"> </w:t>
+      </w:r>
+      <w:r>
+        <w:t xml:space="preserve">the 36 observed jobs. For TDABC purposes the person-hour</w:t>
+      </w:r>
+      <w:r>
+        <w:t xml:space="preserve"> </w:t>
+      </w:r>
+      <w:r>
+        <w:t xml:space="preserve">figure is the quantity to cost, and it should be applied only to jobs</w:t>
+      </w:r>
+      <w:r>
+        <w:t xml:space="preserve"> </w:t>
+      </w:r>
+      <w:r>
+        <w:t xml:space="preserve">that require a disposal trip.</w:t>
       </w:r>
     </w:p>
     <w:bookmarkEnd w:id="19"/>
@@ -1940,25 +2082,25 @@
         <w:t xml:space="preserve"> </w:t>
       </w:r>
       <w:r>
-        <w:t xml:space="preserve">analyse the costs of 23 formal manual emptying providers</w:t>
-      </w:r>
-      <w:r>
-        <w:t xml:space="preserve"> </w:t>
-      </w:r>
-      <w:r>
-        <w:t xml:space="preserve">in Malawi and Uganda and find labour is what makes manual emptying</w:t>
-      </w:r>
-      <w:r>
-        <w:t xml:space="preserve"> </w:t>
-      </w:r>
-      <w:r>
-        <w:t xml:space="preserve">expensive, which is why the person-hours that a team spends travelling to</w:t>
-      </w:r>
-      <w:r>
-        <w:t xml:space="preserve"> </w:t>
-      </w:r>
-      <w:r>
-        <w:t xml:space="preserve">the disposal site are a key costing input.</w:t>
+        <w:t xml:space="preserve">analyse the costs of 23 formal manual emptying</w:t>
+      </w:r>
+      <w:r>
+        <w:t xml:space="preserve"> </w:t>
+      </w:r>
+      <w:r>
+        <w:t xml:space="preserve">providers in Malawi and Uganda and find labour is what makes manual</w:t>
+      </w:r>
+      <w:r>
+        <w:t xml:space="preserve"> </w:t>
+      </w:r>
+      <w:r>
+        <w:t xml:space="preserve">emptying expensive, which is why the person-hours that a team spends</w:t>
+      </w:r>
+      <w:r>
+        <w:t xml:space="preserve"> </w:t>
+      </w:r>
+      <w:r>
+        <w:t xml:space="preserve">travelling to the disposal site are a key costing input.</w:t>
       </w:r>
     </w:p>
     <w:p>
@@ -1976,19 +2118,25 @@
         <w:t xml:space="preserve"> </w:t>
       </w:r>
       <w:r>
-        <w:t xml:space="preserve">designed and tested the pedal-powered Gulper pump in</w:t>
-      </w:r>
-      <w:r>
-        <w:t xml:space="preserve"> </w:t>
-      </w:r>
-      <w:r>
-        <w:t xml:space="preserve">Mzuzu and estimated a pit can be emptied in 1–2 hours when trash content</w:t>
-      </w:r>
-      <w:r>
-        <w:t xml:space="preserve"> </w:t>
-      </w:r>
-      <w:r>
-        <w:t xml:space="preserve">is low, so a half-hour disposal trip is a substantial addition to a job.</w:t>
+        <w:t xml:space="preserve">designed and tested the pedal-powered Gulper</w:t>
+      </w:r>
+      <w:r>
+        <w:t xml:space="preserve"> </w:t>
+      </w:r>
+      <w:r>
+        <w:t xml:space="preserve">pump in Mzuzu and estimated a pit can be emptied in 1–2 hours when</w:t>
+      </w:r>
+      <w:r>
+        <w:t xml:space="preserve"> </w:t>
+      </w:r>
+      <w:r>
+        <w:t xml:space="preserve">trash content is low, so a half-hour disposal trip is a substantial</w:t>
+      </w:r>
+      <w:r>
+        <w:t xml:space="preserve"> </w:t>
+      </w:r>
+      <w:r>
+        <w:t xml:space="preserve">addition to a job.</w:t>
       </w:r>
     </w:p>
     <w:p>
@@ -2012,19 +2160,19 @@
         <w:t xml:space="preserve"> </w:t>
       </w:r>
       <w:r>
-        <w:t xml:space="preserve">Mzuzu, reporting that 90 % of households also dispose of domestic waste</w:t>
-      </w:r>
-      <w:r>
-        <w:t xml:space="preserve"> </w:t>
-      </w:r>
-      <w:r>
-        <w:t xml:space="preserve">in their pits, which affects how much material must be removed and hence</w:t>
-      </w:r>
-      <w:r>
-        <w:t xml:space="preserve"> </w:t>
-      </w:r>
-      <w:r>
-        <w:t xml:space="preserve">how many disposal trips a job needs.</w:t>
+        <w:t xml:space="preserve">Mzuzu, reporting that 90 % of households also dispose of domestic</w:t>
+      </w:r>
+      <w:r>
+        <w:t xml:space="preserve"> </w:t>
+      </w:r>
+      <w:r>
+        <w:t xml:space="preserve">waste in their pits, which affects how much material must be removed</w:t>
+      </w:r>
+      <w:r>
+        <w:t xml:space="preserve"> </w:t>
+      </w:r>
+      <w:r>
+        <w:t xml:space="preserve">and hence how many disposal trips a job needs.</w:t>
       </w:r>
     </w:p>
     <w:p>
@@ -2042,19 +2190,19 @@
         <w:t xml:space="preserve"> </w:t>
       </w:r>
       <w:r>
-        <w:t xml:space="preserve">estimate the cost of delivering pit emptying services in</w:t>
-      </w:r>
-      <w:r>
-        <w:t xml:space="preserve"> </w:t>
-      </w:r>
-      <w:r>
-        <w:t xml:space="preserve">Kigali, Rwanda, at different scales, giving a comparison point for costs</w:t>
-      </w:r>
-      <w:r>
-        <w:t xml:space="preserve"> </w:t>
-      </w:r>
-      <w:r>
-        <w:t xml:space="preserve">derived from the travel times reported here.</w:t>
+        <w:t xml:space="preserve">estimate the cost of delivering pit emptying services</w:t>
+      </w:r>
+      <w:r>
+        <w:t xml:space="preserve"> </w:t>
+      </w:r>
+      <w:r>
+        <w:t xml:space="preserve">in Kigali, Rwanda, at different scales, giving a comparison point</w:t>
+      </w:r>
+      <w:r>
+        <w:t xml:space="preserve"> </w:t>
+      </w:r>
+      <w:r>
+        <w:t xml:space="preserve">for costs derived from the travel times reported here.</w:t>
       </w:r>
     </w:p>
     <w:bookmarkEnd w:id="20"/>

</xml_diff>